<commit_message>
docs: regenerate Define Problem Statement to match screenshot template exactly
</commit_message>
<xml_diff>
--- a/Project Documentation/1. Brainstorming & Ideation/Define Problem Statement.docx
+++ b/Project Documentation/1. Brainstorming & Ideation/Define Problem Statement.docx
@@ -58,7 +58,7 @@
           </w:tcPr>
           <w:p>
             <w:r>
-              <w:t>15 March 2026</w:t>
+              <w:t>15 March 2024</w:t>
             </w:r>
           </w:p>
         </w:tc>
@@ -80,7 +80,7 @@
           </w:tcPr>
           <w:p>
             <w:r>
-              <w:t>PNT2022TMID124356</w:t>
+              <w:t>xxxxxx</w:t>
             </w:r>
           </w:p>
         </w:tc>
@@ -102,7 +102,7 @@
           </w:tcPr>
           <w:p>
             <w:r>
-              <w:t>SmartLender AI – Loan Eligibility Prediction</w:t>
+              <w:t>xxxxxx</w:t>
             </w:r>
           </w:p>
         </w:tc>
@@ -114,7 +114,7 @@
           </w:tcPr>
           <w:p>
             <w:r>
-              <w:t>Submission Stage</w:t>
+              <w:t>Maximum Marks</w:t>
             </w:r>
           </w:p>
         </w:tc>
@@ -124,7 +124,7 @@
           </w:tcPr>
           <w:p>
             <w:r>
-              <w:t>1. Brainstorming &amp; Ideation</w:t>
+              <w:t>3 Marks</w:t>
             </w:r>
           </w:p>
         </w:tc>
@@ -140,12 +140,12 @@
         <w:pStyle w:val="Heading1"/>
       </w:pPr>
       <w:r>
-        <w:t>Customer Problem Statement Context</w:t>
+        <w:t>Define Problem Statements (Customer Problem Statement Template):</w:t>
       </w:r>
     </w:p>
     <w:p>
       <w:r>
-        <w:t>This report details the primary pain points, customer demographic scenarios, and operational hindrances evaluated for the SmartLender AI loan pre-approval portal.</w:t>
+        <w:t>Create a problem statement to understand your customer's point of view. The Customer Problem Statement template helps you focus on what matters to create experiences people will love. A well-articulated customer problem statement allows you and your team to find the ideal solution for your customers' challenges. Throughout the process, you'll also be able to empathize with your customers, which helps you better understand how they perceive your product or service.</w:t>
       </w:r>
     </w:p>
     <w:p>
@@ -153,7 +153,20 @@
         <w:pStyle w:val="Heading1"/>
       </w:pPr>
       <w:r>
-        <w:t>Problem Statement Matrix</w:t>
+        <w:t>Example:</w:t>
+      </w:r>
+    </w:p>
+    <w:p>
+      <w:r>
+        <w:t>I am: Applicant seeking a loan.</w:t>
+        <w:br/>
+        <w:t>I'm trying to: Secure a loan for the property.</w:t>
+        <w:br/>
+        <w:t>But: Married with no co-applicant income.</w:t>
+        <w:br/>
+        <w:t>Because: Self-employed with a good credit history.</w:t>
+        <w:br/>
+        <w:t>Which makes me feel: Optimistic about loan approval.</w:t>
       </w:r>
     </w:p>
     <w:tbl>
@@ -248,7 +261,7 @@
           </w:tcPr>
           <w:p>
             <w:r>
-              <w:t>A self-employed business owner</w:t>
+              <w:t>A male applicant seeking a loan.</w:t>
             </w:r>
           </w:p>
         </w:tc>
@@ -258,7 +271,7 @@
           </w:tcPr>
           <w:p>
             <w:r>
-              <w:t>Secure a home loan of $150k</w:t>
+              <w:t>Secure a loan for the property</w:t>
             </w:r>
           </w:p>
         </w:tc>
@@ -268,7 +281,7 @@
           </w:tcPr>
           <w:p>
             <w:r>
-              <w:t>Irregular income is rejected</w:t>
+              <w:t>Married with no co-applicant income.</w:t>
             </w:r>
           </w:p>
         </w:tc>
@@ -278,7 +291,7 @@
           </w:tcPr>
           <w:p>
             <w:r>
-              <w:t>Standard banks require rigid paystubs</w:t>
+              <w:t>Self-employed with a good credit history.</w:t>
             </w:r>
           </w:p>
         </w:tc>
@@ -288,136 +301,17 @@
           </w:tcPr>
           <w:p>
             <w:r>
-              <w:t>Excluded &amp; anxious</w:t>
-            </w:r>
-          </w:p>
-        </w:tc>
-      </w:tr>
-      <w:tr>
-        <w:tc>
-          <w:tcPr>
-            <w:tcW w:type="dxa" w:w="1440"/>
-          </w:tcPr>
-          <w:p>
-            <w:r>
-              <w:t>PS-2</w:t>
-            </w:r>
-          </w:p>
-        </w:tc>
-        <w:tc>
-          <w:tcPr>
-            <w:tcW w:type="dxa" w:w="1440"/>
-          </w:tcPr>
-          <w:p>
-            <w:r>
-              <w:t>A salaried single graduate</w:t>
-            </w:r>
-          </w:p>
-        </w:tc>
-        <w:tc>
-          <w:tcPr>
-            <w:tcW w:type="dxa" w:w="1440"/>
-          </w:tcPr>
-          <w:p>
-            <w:r>
-              <w:t>Verify home loan eligibility</w:t>
-            </w:r>
-          </w:p>
-        </w:tc>
-        <w:tc>
-          <w:tcPr>
-            <w:tcW w:type="dxa" w:w="1440"/>
-          </w:tcPr>
-          <w:p>
-            <w:r>
-              <w:t>Processing takes two weeks</w:t>
-            </w:r>
-          </w:p>
-        </w:tc>
-        <w:tc>
-          <w:tcPr>
-            <w:tcW w:type="dxa" w:w="1440"/>
-          </w:tcPr>
-          <w:p>
-            <w:r>
-              <w:t>The underwriting queue is manual</w:t>
-            </w:r>
-          </w:p>
-        </w:tc>
-        <w:tc>
-          <w:tcPr>
-            <w:tcW w:type="dxa" w:w="1440"/>
-          </w:tcPr>
-          <w:p>
-            <w:r>
-              <w:t>Frustrated &amp; uncertain</w:t>
-            </w:r>
-          </w:p>
-        </w:tc>
-      </w:tr>
-      <w:tr>
-        <w:tc>
-          <w:tcPr>
-            <w:tcW w:type="dxa" w:w="1440"/>
-          </w:tcPr>
-          <w:p>
-            <w:r>
-              <w:t>PS-3</w:t>
-            </w:r>
-          </w:p>
-        </w:tc>
-        <w:tc>
-          <w:tcPr>
-            <w:tcW w:type="dxa" w:w="1440"/>
-          </w:tcPr>
-          <w:p>
-            <w:r>
-              <w:t>An applicant with bad history</w:t>
-            </w:r>
-          </w:p>
-        </w:tc>
-        <w:tc>
-          <w:tcPr>
-            <w:tcW w:type="dxa" w:w="1440"/>
-          </w:tcPr>
-          <w:p>
-            <w:r>
-              <w:t>Obtain a loan of $50k</w:t>
-            </w:r>
-          </w:p>
-        </w:tc>
-        <w:tc>
-          <w:tcPr>
-            <w:tcW w:type="dxa" w:w="1440"/>
-          </w:tcPr>
-          <w:p>
-            <w:r>
-              <w:t>System vetoes my request</w:t>
-            </w:r>
-          </w:p>
-        </w:tc>
-        <w:tc>
-          <w:tcPr>
-            <w:tcW w:type="dxa" w:w="1440"/>
-          </w:tcPr>
-          <w:p>
-            <w:r>
-              <w:t>No clear reasons or paths are given</w:t>
-            </w:r>
-          </w:p>
-        </w:tc>
-        <w:tc>
-          <w:tcPr>
-            <w:tcW w:type="dxa" w:w="1440"/>
-          </w:tcPr>
-          <w:p>
-            <w:r>
-              <w:t>Ostracized &amp; helpless</w:t>
+              <w:t>Optimistic about loan approval.</w:t>
             </w:r>
           </w:p>
         </w:tc>
       </w:tr>
     </w:tbl>
+    <w:p>
+      <w:r>
+        <w:br/>
+      </w:r>
+    </w:p>
     <w:sectPr>
       <w:pgSz w:w="12240" w:h="15840"/>
       <w:pgMar w:top="1440" w:right="1800" w:bottom="1440" w:left="1800" w:header="720" w:footer="720" w:gutter="0"/>

</xml_diff>